<commit_message>
# update dispersal and figures
</commit_message>
<xml_diff>
--- a/output tables/model_dispersal.docx
+++ b/output tables/model_dispersal.docx
@@ -394,7 +394,7 @@
                 <w:szCs w:val="22"/>
                 <w:color w:val="000000"/>
               </w:rPr>
-              <w:t xml:space="preserve">3.46</w:t>
+              <w:t xml:space="preserve">3.69</w:t>
             </w:r>
           </w:p>
         </w:tc>
@@ -447,7 +447,7 @@
                 <w:szCs w:val="22"/>
                 <w:color w:val="000000"/>
               </w:rPr>
-              <w:t xml:space="preserve">3.00</w:t>
+              <w:t xml:space="preserve">3.28</w:t>
             </w:r>
           </w:p>
         </w:tc>
@@ -500,7 +500,7 @@
                 <w:szCs w:val="22"/>
                 <w:color w:val="000000"/>
               </w:rPr>
-              <w:t xml:space="preserve">3.90</w:t>
+              <w:t xml:space="preserve">4.11</w:t>
             </w:r>
           </w:p>
         </w:tc>
@@ -665,7 +665,7 @@
                 <w:szCs w:val="22"/>
                 <w:color w:val="000000"/>
               </w:rPr>
-              <w:t xml:space="preserve">-0.01</w:t>
+              <w:t xml:space="preserve">-0.07</w:t>
             </w:r>
           </w:p>
         </w:tc>
@@ -718,7 +718,7 @@
                 <w:szCs w:val="22"/>
                 <w:color w:val="000000"/>
               </w:rPr>
-              <w:t xml:space="preserve">-0.10</w:t>
+              <w:t xml:space="preserve">-0.16</w:t>
             </w:r>
           </w:p>
         </w:tc>
@@ -771,7 +771,7 @@
                 <w:szCs w:val="22"/>
                 <w:color w:val="000000"/>
               </w:rPr>
-              <w:t xml:space="preserve">0.09</w:t>
+              <w:t xml:space="preserve">0.02</w:t>
             </w:r>
           </w:p>
         </w:tc>
@@ -936,7 +936,7 @@
                 <w:szCs w:val="22"/>
                 <w:color w:val="000000"/>
               </w:rPr>
-              <w:t xml:space="preserve">-0.11</w:t>
+              <w:t xml:space="preserve">-0.08</w:t>
             </w:r>
           </w:p>
         </w:tc>
@@ -989,7 +989,7 @@
                 <w:szCs w:val="22"/>
                 <w:color w:val="000000"/>
               </w:rPr>
-              <w:t xml:space="preserve">-0.39</w:t>
+              <w:t xml:space="preserve">-0.30</w:t>
             </w:r>
           </w:p>
         </w:tc>
@@ -1042,7 +1042,7 @@
                 <w:szCs w:val="22"/>
                 <w:color w:val="000000"/>
               </w:rPr>
-              <w:t xml:space="preserve">0.17</w:t>
+              <w:t xml:space="preserve">0.15</w:t>
             </w:r>
           </w:p>
         </w:tc>
@@ -1207,7 +1207,7 @@
                 <w:szCs w:val="22"/>
                 <w:color w:val="000000"/>
               </w:rPr>
-              <w:t xml:space="preserve">0.03</w:t>
+              <w:t xml:space="preserve">0.08</w:t>
             </w:r>
           </w:p>
         </w:tc>
@@ -1260,7 +1260,7 @@
                 <w:szCs w:val="22"/>
                 <w:color w:val="000000"/>
               </w:rPr>
-              <w:t xml:space="preserve">-0.12</w:t>
+              <w:t xml:space="preserve">-0.05</w:t>
             </w:r>
           </w:p>
         </w:tc>
@@ -1313,7 +1313,7 @@
                 <w:szCs w:val="22"/>
                 <w:color w:val="000000"/>
               </w:rPr>
-              <w:t xml:space="preserve">0.19</w:t>
+              <w:t xml:space="preserve">0.22</w:t>
             </w:r>
           </w:p>
         </w:tc>
@@ -1478,7 +1478,7 @@
                 <w:szCs w:val="22"/>
                 <w:color w:val="000000"/>
               </w:rPr>
-              <w:t xml:space="preserve">-0.03</w:t>
+              <w:t xml:space="preserve">0.01</w:t>
             </w:r>
           </w:p>
         </w:tc>
@@ -1531,7 +1531,7 @@
                 <w:szCs w:val="22"/>
                 <w:color w:val="000000"/>
               </w:rPr>
-              <w:t xml:space="preserve">-0.41</w:t>
+              <w:t xml:space="preserve">-0.23</w:t>
             </w:r>
           </w:p>
         </w:tc>
@@ -1584,7 +1584,7 @@
                 <w:szCs w:val="22"/>
                 <w:color w:val="000000"/>
               </w:rPr>
-              <w:t xml:space="preserve">0.37</w:t>
+              <w:t xml:space="preserve">0.26</w:t>
             </w:r>
           </w:p>
         </w:tc>
@@ -1749,7 +1749,7 @@
                 <w:szCs w:val="22"/>
                 <w:color w:val="000000"/>
               </w:rPr>
-              <w:t xml:space="preserve">0.43</w:t>
+              <w:t xml:space="preserve">0.26</w:t>
             </w:r>
           </w:p>
         </w:tc>
@@ -1802,7 +1802,7 @@
                 <w:szCs w:val="22"/>
                 <w:color w:val="000000"/>
               </w:rPr>
-              <w:t xml:space="preserve">0.14</w:t>
+              <w:t xml:space="preserve">-0.02</w:t>
             </w:r>
           </w:p>
         </w:tc>
@@ -1855,7 +1855,7 @@
                 <w:szCs w:val="22"/>
                 <w:color w:val="000000"/>
               </w:rPr>
-              <w:t xml:space="preserve">0.72</w:t>
+              <w:t xml:space="preserve">0.54</w:t>
             </w:r>
           </w:p>
         </w:tc>
@@ -2020,7 +2020,7 @@
                 <w:szCs w:val="22"/>
                 <w:color w:val="000000"/>
               </w:rPr>
-              <w:t xml:space="preserve">0.29</w:t>
+              <w:t xml:space="preserve">0.15</w:t>
             </w:r>
           </w:p>
         </w:tc>
@@ -2126,7 +2126,7 @@
                 <w:szCs w:val="22"/>
                 <w:color w:val="000000"/>
               </w:rPr>
-              <w:t xml:space="preserve">0.73</w:t>
+              <w:t xml:space="preserve">0.44</w:t>
             </w:r>
           </w:p>
         </w:tc>
@@ -2291,7 +2291,7 @@
                 <w:szCs w:val="22"/>
                 <w:color w:val="000000"/>
               </w:rPr>
-              <w:t xml:space="preserve">-0.47</w:t>
+              <w:t xml:space="preserve">-0.56</w:t>
             </w:r>
           </w:p>
         </w:tc>
@@ -2344,7 +2344,7 @@
                 <w:szCs w:val="22"/>
                 <w:color w:val="000000"/>
               </w:rPr>
-              <w:t xml:space="preserve">-0.96</w:t>
+              <w:t xml:space="preserve">-0.91</w:t>
             </w:r>
           </w:p>
         </w:tc>
@@ -2397,7 +2397,7 @@
                 <w:szCs w:val="22"/>
                 <w:color w:val="000000"/>
               </w:rPr>
-              <w:t xml:space="preserve">0.02</w:t>
+              <w:t xml:space="preserve">-0.20</w:t>
             </w:r>
           </w:p>
         </w:tc>

</xml_diff>